<commit_message>
To clarify the document tone, description, and role
이후 진행 기준으로 잡고 진행
</commit_message>
<xml_diff>
--- a/docs/v0.1/anchor.docx
+++ b/docs/v0.1/anchor.docx
@@ -4,76 +4,83 @@
   <w:body>
     <w:p>
       <w:pPr>
-        <w:pStyle w:val="SmallGray"/>
-        <w:jc w:val="left"/>
+        <w:jc w:val="center"/>
       </w:pPr>
       <w:r>
         <w:rPr>
-          <w:rFonts w:ascii="NanumGothic" w:hAnsi="NanumGothic" w:eastAsia="NanumGothic"/>
+          <w:rFonts w:ascii="Malgun Gothic" w:hAnsi="Malgun Gothic" w:eastAsia="Malgun Gothic"/>
           <w:b/>
-          <w:color w:val="2563EB"/>
-        </w:rPr>
-        <w:t>CURRENT POSITION ANCHOR</w:t>
-      </w:r>
-    </w:p>
-    <w:p>
-      <w:pPr>
-        <w:pStyle w:val="Title"/>
-        <w:jc w:val="left"/>
-      </w:pPr>
-      <w:r>
-        <w:rPr>
-          <w:rFonts w:ascii="NanumGothic" w:hAnsi="NanumGothic" w:eastAsia="NanumGothic"/>
+          <w:sz w:val="38"/>
         </w:rPr>
         <w:t>항공권 구매 의사결정 보조 시스템</w:t>
       </w:r>
     </w:p>
     <w:p>
       <w:pPr>
-        <w:jc w:val="left"/>
+        <w:jc w:val="center"/>
       </w:pPr>
       <w:r>
         <w:rPr>
-          <w:rFonts w:ascii="NanumGothic" w:hAnsi="NanumGothic" w:eastAsia="NanumGothic"/>
-          <w:color w:val="4B5563"/>
-          <w:sz w:val="23"/>
+          <w:rFonts w:ascii="Malgun Gothic" w:hAnsi="Malgun Gothic" w:eastAsia="Malgun Gothic"/>
+          <w:b/>
+          <w:color w:val="52607A"/>
+          <w:sz w:val="24"/>
         </w:rPr>
-        <w:t>현위치 앵커 문서 v2</w:t>
+        <w:t>현위치 앵커 문서</w:t>
       </w:r>
     </w:p>
-    <w:p/>
+    <w:p>
+      <w:pPr>
+        <w:pStyle w:val="SmallNote"/>
+        <w:jc w:val="center"/>
+      </w:pPr>
+      <w:r>
+        <w:t>작성일 2026-03-23  |  최종 수정일 2026-03-23</w:t>
+      </w:r>
+    </w:p>
+    <w:p>
+      <w:pPr>
+        <w:jc w:val="center"/>
+      </w:pPr>
+      <w:r>
+        <w:rPr>
+          <w:color w:val="A0AAB9"/>
+        </w:rPr>
+        <w:t>—</w:t>
+      </w:r>
+    </w:p>
     <w:tbl>
       <w:tblPr>
         <w:tblW w:type="auto" w:w="0"/>
-        <w:jc w:val="left"/>
+        <w:jc w:val="center"/>
+        <w:tblLayout w:type="autofit"/>
         <w:tblLook w:firstColumn="1" w:firstRow="1" w:lastColumn="0" w:lastRow="0" w:noHBand="0" w:noVBand="1" w:val="04A0"/>
       </w:tblPr>
       <w:tblGrid>
-        <w:gridCol w:w="8352"/>
+        <w:gridCol w:w="9632"/>
       </w:tblGrid>
       <w:tr>
         <w:tc>
           <w:tcPr>
             <w:tcW w:type="dxa" w:w="9632"/>
-            <w:vAlign w:val="center"/>
-            <w:shd w:fill="F5F8FC"/>
-            <w:tcBorders>
-              <w:top w:val="single" w:sz="8" w:color="D9E2F2" w:space="0"/>
-              <w:left w:val="single" w:sz="8" w:color="D9E2F2" w:space="0"/>
-              <w:bottom w:val="single" w:sz="8" w:color="D9E2F2" w:space="0"/>
-              <w:right w:val="single" w:sz="8" w:color="D9E2F2" w:space="0"/>
-            </w:tcBorders>
+            <w:shd w:fill="EAF1FB"/>
+            <w:tcMar>
+              <w:top w:w="80" w:type="dxa"/>
+              <w:start w:w="90" w:type="dxa"/>
+              <w:bottom w:w="80" w:type="dxa"/>
+              <w:end w:w="90" w:type="dxa"/>
+            </w:tcMar>
           </w:tcPr>
           <w:p>
             <w:pPr>
-              <w:spacing w:before="80" w:after="80"/>
+              <w:jc w:val="left"/>
             </w:pPr>
             <w:r>
               <w:rPr>
-                <w:rFonts w:ascii="NanumGothic" w:hAnsi="NanumGothic" w:eastAsia="NanumGothic"/>
-                <w:sz w:val="20"/>
+                <w:b/>
+                <w:color w:val="22344E"/>
               </w:rPr>
-              <w:t>문서 역할: 현재 프로젝트 위치 정렬</w:t>
+              <w:t>현재 상태 요약</w:t>
             </w:r>
           </w:p>
         </w:tc>
@@ -82,25 +89,16 @@
         <w:tc>
           <w:tcPr>
             <w:tcW w:type="dxa" w:w="9632"/>
-            <w:vAlign w:val="center"/>
-            <w:shd w:fill="F5F8FC"/>
-            <w:tcBorders>
-              <w:top w:val="single" w:sz="8" w:color="D9E2F2" w:space="0"/>
-              <w:left w:val="single" w:sz="8" w:color="D9E2F2" w:space="0"/>
-              <w:bottom w:val="single" w:sz="8" w:color="D9E2F2" w:space="0"/>
-              <w:right w:val="single" w:sz="8" w:color="D9E2F2" w:space="0"/>
-            </w:tcBorders>
+            <w:tcMar>
+              <w:top w:w="80" w:type="dxa"/>
+              <w:start w:w="90" w:type="dxa"/>
+              <w:bottom w:w="80" w:type="dxa"/>
+              <w:end w:w="90" w:type="dxa"/>
+            </w:tcMar>
           </w:tcPr>
           <w:p>
-            <w:pPr>
-              <w:spacing w:before="80" w:after="80"/>
-            </w:pPr>
             <w:r>
-              <w:rPr>
-                <w:rFonts w:ascii="NanumGothic" w:hAnsi="NanumGothic" w:eastAsia="NanumGothic"/>
-                <w:sz w:val="20"/>
-              </w:rPr>
-              <w:t>사용 시점: 체크리스트 실행 전·중간 점검용</w:t>
+              <w:t>본 프로젝트의 현재 해석은 ‘항공권 가격 예측’보다 ‘구매 시점 판단을 돕는 의사결정 보조’에 가깝다.</w:t>
             </w:r>
           </w:p>
         </w:tc>
@@ -109,149 +107,16 @@
         <w:tc>
           <w:tcPr>
             <w:tcW w:type="dxa" w:w="9632"/>
-            <w:vAlign w:val="center"/>
-            <w:shd w:fill="F5F8FC"/>
-            <w:tcBorders>
-              <w:top w:val="single" w:sz="8" w:color="D9E2F2" w:space="0"/>
-              <w:left w:val="single" w:sz="8" w:color="D9E2F2" w:space="0"/>
-              <w:bottom w:val="single" w:sz="8" w:color="D9E2F2" w:space="0"/>
-              <w:right w:val="single" w:sz="8" w:color="D9E2F2" w:space="0"/>
-            </w:tcBorders>
+            <w:tcMar>
+              <w:top w:w="80" w:type="dxa"/>
+              <w:start w:w="90" w:type="dxa"/>
+              <w:bottom w:w="80" w:type="dxa"/>
+              <w:end w:w="90" w:type="dxa"/>
+            </w:tcMar>
           </w:tcPr>
           <w:p>
-            <w:pPr>
-              <w:spacing w:before="80" w:after="80"/>
-            </w:pPr>
             <w:r>
-              <w:rPr>
-                <w:rFonts w:ascii="NanumGothic" w:hAnsi="NanumGothic" w:eastAsia="NanumGothic"/>
-                <w:sz w:val="20"/>
-              </w:rPr>
-              <w:t>다음 단계: 바운더리 탐색 후 MVP 설계문서로 연결</w:t>
-            </w:r>
-          </w:p>
-        </w:tc>
-      </w:tr>
-    </w:tbl>
-    <w:p/>
-    <w:tbl>
-      <w:tblPr>
-        <w:tblW w:type="auto" w:w="0"/>
-        <w:jc w:val="center"/>
-        <w:tblLook w:firstColumn="1" w:firstRow="1" w:lastColumn="0" w:lastRow="0" w:noHBand="0" w:noVBand="1" w:val="04A0"/>
-      </w:tblPr>
-      <w:tblGrid>
-        <w:gridCol w:w="8784"/>
-      </w:tblGrid>
-      <w:tr>
-        <w:tc>
-          <w:tcPr>
-            <w:tcW w:type="dxa" w:w="9632"/>
-            <w:vAlign w:val="center"/>
-            <w:shd w:fill="EAF2FF"/>
-            <w:tcBorders>
-              <w:top w:val="single" w:sz="8" w:color="D9E2F2" w:space="0"/>
-              <w:left w:val="single" w:sz="8" w:color="D9E2F2" w:space="0"/>
-              <w:bottom w:val="single" w:sz="8" w:color="D9E2F2" w:space="0"/>
-              <w:right w:val="single" w:sz="8" w:color="D9E2F2" w:space="0"/>
-            </w:tcBorders>
-          </w:tcPr>
-          <w:p>
-            <w:pPr>
-              <w:spacing w:before="80" w:after="80"/>
-            </w:pPr>
-            <w:r>
-              <w:rPr>
-                <w:rFonts w:ascii="NanumGothic" w:hAnsi="NanumGothic" w:eastAsia="NanumGothic"/>
-                <w:b/>
-                <w:color w:val="2563EB"/>
-                <w:sz w:val="21"/>
-              </w:rPr>
-              <w:t>이 문서는 무엇을 위한 문서인가</w:t>
-            </w:r>
-          </w:p>
-        </w:tc>
-      </w:tr>
-      <w:tr>
-        <w:tc>
-          <w:tcPr>
-            <w:tcW w:type="dxa" w:w="9632"/>
-            <w:vAlign w:val="center"/>
-            <w:shd w:fill="FFFFFF"/>
-            <w:tcBorders>
-              <w:top w:val="single" w:sz="8" w:color="D9E2F2" w:space="0"/>
-              <w:left w:val="single" w:sz="8" w:color="D9E2F2" w:space="0"/>
-              <w:bottom w:val="single" w:sz="8" w:color="D9E2F2" w:space="0"/>
-              <w:right w:val="single" w:sz="8" w:color="D9E2F2" w:space="0"/>
-            </w:tcBorders>
-          </w:tcPr>
-          <w:p>
-            <w:pPr>
-              <w:spacing w:before="80" w:after="80"/>
-            </w:pPr>
-            <w:r>
-              <w:rPr>
-                <w:rFonts w:ascii="NanumGothic" w:hAnsi="NanumGothic" w:eastAsia="NanumGothic"/>
-                <w:b w:val="0"/>
-                <w:sz w:val="20"/>
-              </w:rPr>
-              <w:t>이 문서는 설계 확정문서가 아니라 현재 위치를 고정하기 위한 기준 문서다.</w:t>
-            </w:r>
-          </w:p>
-        </w:tc>
-      </w:tr>
-      <w:tr>
-        <w:tc>
-          <w:tcPr>
-            <w:tcW w:type="dxa" w:w="9632"/>
-            <w:vAlign w:val="center"/>
-            <w:shd w:fill="FFFFFF"/>
-            <w:tcBorders>
-              <w:top w:val="single" w:sz="8" w:color="D9E2F2" w:space="0"/>
-              <w:left w:val="single" w:sz="8" w:color="D9E2F2" w:space="0"/>
-              <w:bottom w:val="single" w:sz="8" w:color="D9E2F2" w:space="0"/>
-              <w:right w:val="single" w:sz="8" w:color="D9E2F2" w:space="0"/>
-            </w:tcBorders>
-          </w:tcPr>
-          <w:p>
-            <w:pPr>
-              <w:spacing w:before="80" w:after="80"/>
-            </w:pPr>
-            <w:r>
-              <w:rPr>
-                <w:rFonts w:ascii="NanumGothic" w:hAnsi="NanumGothic" w:eastAsia="NanumGothic"/>
-                <w:b w:val="0"/>
-                <w:sz w:val="20"/>
-              </w:rPr>
-              <w:t>지금 무엇이 확정되었고 무엇이 아직 열려 있는지 빠르게 이해할 수 있어야 한다.</w:t>
-            </w:r>
-          </w:p>
-        </w:tc>
-      </w:tr>
-      <w:tr>
-        <w:tc>
-          <w:tcPr>
-            <w:tcW w:type="dxa" w:w="9632"/>
-            <w:vAlign w:val="center"/>
-            <w:shd w:fill="FFFFFF"/>
-            <w:tcBorders>
-              <w:top w:val="single" w:sz="8" w:color="D9E2F2" w:space="0"/>
-              <w:left w:val="single" w:sz="8" w:color="D9E2F2" w:space="0"/>
-              <w:bottom w:val="single" w:sz="8" w:color="D9E2F2" w:space="0"/>
-              <w:right w:val="single" w:sz="8" w:color="D9E2F2" w:space="0"/>
-            </w:tcBorders>
-          </w:tcPr>
-          <w:p>
-            <w:pPr>
-              <w:spacing w:before="80" w:after="80"/>
-            </w:pPr>
-            <w:r>
-              <w:rPr>
-                <w:rFonts w:ascii="NanumGothic" w:hAnsi="NanumGothic" w:eastAsia="NanumGothic"/>
-                <w:b w:val="0"/>
-                <w:sz w:val="20"/>
-              </w:rPr>
-              <w:t>회의나 작업 중 방향이 흔들릴 때 기준점으로 다시 돌아오기 위한 문서다.</w:t>
+              <w:t>현재 단계의 핵심 과제는 데이터 바운더리 확인이며, 분석 단위·MVP·구현 방식은 후속 단계에서 확정한다.</w:t>
             </w:r>
           </w:p>
         </w:tc>
@@ -261,59 +126,35 @@
     <w:p>
       <w:pPr>
         <w:pStyle w:val="Heading1"/>
-        <w:spacing w:before="200" w:after="80"/>
+        <w:spacing w:before="160" w:after="80"/>
       </w:pPr>
       <w:r>
-        <w:rPr>
-          <w:rFonts w:ascii="NanumGothic" w:hAnsi="NanumGothic" w:eastAsia="NanumGothic"/>
-        </w:rPr>
-        <w:t>1. 현재 프로젝트의 한 줄 정의</w:t>
-      </w:r>
-    </w:p>
-    <w:p>
-      <w:pPr>
-        <w:spacing w:lineRule="auto" w:line="307" w:after="120"/>
-      </w:pPr>
-      <w:r>
-        <w:rPr>
-          <w:rFonts w:ascii="NanumGothic" w:hAnsi="NanumGothic" w:eastAsia="NanumGothic"/>
-        </w:rPr>
-        <w:t>현재 주제는 항공권 가격 자체를 맞히는 프로젝트보다, 사용자가 지금 예약할지 조금 더 기다릴지를 판단할 때 참고할 수 있는 구매 의사결정 보조 시스템으로 이해하는 것이 적절하다. 따라서 지금 단계의 핵심은 모델을 고르는 일이 아니라, 실제로 어떤 데이터 범위와 어떤 비교 단위가 가능한지 확인하는 일이다.</w:t>
-      </w:r>
-    </w:p>
-    <w:p>
-      <w:pPr>
-        <w:pStyle w:val="Heading1"/>
-        <w:spacing w:before="200" w:after="80"/>
-      </w:pPr>
-      <w:r>
-        <w:rPr>
-          <w:rFonts w:ascii="NanumGothic" w:hAnsi="NanumGothic" w:eastAsia="NanumGothic"/>
-        </w:rPr>
-        <w:t>2. 지금 확정된 것</w:t>
+        <w:t>1. 현재 기준</w:t>
       </w:r>
     </w:p>
     <w:tbl>
       <w:tblPr>
+        <w:tblStyle w:val="TableGrid"/>
         <w:tblW w:type="auto" w:w="0"/>
         <w:jc w:val="center"/>
         <w:tblLook w:firstColumn="1" w:firstRow="1" w:lastColumn="0" w:lastRow="0" w:noHBand="0" w:noVBand="1" w:val="04A0"/>
       </w:tblPr>
       <w:tblGrid>
-        <w:gridCol w:w="3024"/>
-        <w:gridCol w:w="5760"/>
+        <w:gridCol w:w="4816"/>
+        <w:gridCol w:w="4816"/>
       </w:tblGrid>
       <w:tr>
         <w:tc>
           <w:tcPr>
             <w:tcW w:type="dxa" w:w="4816"/>
-            <w:shd w:fill="EDF3FB"/>
-            <w:tcBorders>
-              <w:top w:val="single" w:sz="6" w:color="D9E2F2" w:space="0"/>
-              <w:left w:val="single" w:sz="6" w:color="D9E2F2" w:space="0"/>
-              <w:bottom w:val="single" w:sz="6" w:color="D9E2F2" w:space="0"/>
-              <w:right w:val="single" w:sz="6" w:color="D9E2F2" w:space="0"/>
-            </w:tcBorders>
+            <w:shd w:fill="DCE6F1"/>
+            <w:tcMar>
+              <w:top w:w="90" w:type="dxa"/>
+              <w:start w:w="100" w:type="dxa"/>
+              <w:bottom w:w="90" w:type="dxa"/>
+              <w:end w:w="100" w:type="dxa"/>
+            </w:tcMar>
+            <w:vAlign w:val="center"/>
           </w:tcPr>
           <w:p>
             <w:pPr>
@@ -321,24 +162,23 @@
             </w:pPr>
             <w:r>
               <w:rPr>
-                <w:rFonts w:ascii="NanumGothic" w:hAnsi="NanumGothic" w:eastAsia="NanumGothic"/>
                 <w:b/>
-                <w:sz w:val="20"/>
               </w:rPr>
-              <w:t>항목</w:t>
+              <w:t>구분</w:t>
             </w:r>
           </w:p>
         </w:tc>
         <w:tc>
           <w:tcPr>
             <w:tcW w:type="dxa" w:w="4816"/>
-            <w:shd w:fill="EDF3FB"/>
-            <w:tcBorders>
-              <w:top w:val="single" w:sz="6" w:color="D9E2F2" w:space="0"/>
-              <w:left w:val="single" w:sz="6" w:color="D9E2F2" w:space="0"/>
-              <w:bottom w:val="single" w:sz="6" w:color="D9E2F2" w:space="0"/>
-              <w:right w:val="single" w:sz="6" w:color="D9E2F2" w:space="0"/>
-            </w:tcBorders>
+            <w:shd w:fill="DCE6F1"/>
+            <w:tcMar>
+              <w:top w:w="90" w:type="dxa"/>
+              <w:start w:w="100" w:type="dxa"/>
+              <w:bottom w:w="90" w:type="dxa"/>
+              <w:end w:w="100" w:type="dxa"/>
+            </w:tcMar>
+            <w:vAlign w:val="center"/>
           </w:tcPr>
           <w:p>
             <w:pPr>
@@ -346,11 +186,9 @@
             </w:pPr>
             <w:r>
               <w:rPr>
-                <w:rFonts w:ascii="NanumGothic" w:hAnsi="NanumGothic" w:eastAsia="NanumGothic"/>
                 <w:b/>
-                <w:sz w:val="20"/>
               </w:rPr>
-              <w:t>현재 고정된 내용</w:t>
+              <w:t>현재 기준</w:t>
             </w:r>
           </w:p>
         </w:tc>
@@ -359,24 +197,20 @@
         <w:tc>
           <w:tcPr>
             <w:tcW w:type="dxa" w:w="4816"/>
-            <w:tcBorders>
-              <w:top w:val="single" w:sz="6" w:color="D9E2F2" w:space="0"/>
-              <w:left w:val="single" w:sz="6" w:color="D9E2F2" w:space="0"/>
-              <w:bottom w:val="single" w:sz="6" w:color="D9E2F2" w:space="0"/>
-              <w:right w:val="single" w:sz="6" w:color="D9E2F2" w:space="0"/>
-            </w:tcBorders>
+            <w:tcMar>
+              <w:top w:w="80" w:type="dxa"/>
+              <w:start w:w="90" w:type="dxa"/>
+              <w:bottom w:w="80" w:type="dxa"/>
+              <w:end w:w="90" w:type="dxa"/>
+            </w:tcMar>
             <w:vAlign w:val="center"/>
           </w:tcPr>
           <w:p>
             <w:pPr>
-              <w:spacing w:before="60" w:after="60"/>
+              <w:spacing w:after="20"/>
               <w:jc w:val="center"/>
             </w:pPr>
             <w:r>
-              <w:rPr>
-                <w:rFonts w:ascii="NanumGothic" w:hAnsi="NanumGothic" w:eastAsia="NanumGothic"/>
-                <w:sz w:val="20"/>
-              </w:rPr>
               <w:t>주제 방향</w:t>
             </w:r>
           </w:p>
@@ -384,25 +218,21 @@
         <w:tc>
           <w:tcPr>
             <w:tcW w:type="dxa" w:w="4816"/>
-            <w:tcBorders>
-              <w:top w:val="single" w:sz="6" w:color="D9E2F2" w:space="0"/>
-              <w:left w:val="single" w:sz="6" w:color="D9E2F2" w:space="0"/>
-              <w:bottom w:val="single" w:sz="6" w:color="D9E2F2" w:space="0"/>
-              <w:right w:val="single" w:sz="6" w:color="D9E2F2" w:space="0"/>
-            </w:tcBorders>
+            <w:tcMar>
+              <w:top w:w="80" w:type="dxa"/>
+              <w:start w:w="90" w:type="dxa"/>
+              <w:bottom w:w="80" w:type="dxa"/>
+              <w:end w:w="90" w:type="dxa"/>
+            </w:tcMar>
             <w:vAlign w:val="center"/>
           </w:tcPr>
           <w:p>
             <w:pPr>
-              <w:spacing w:before="60" w:after="60"/>
+              <w:spacing w:after="20"/>
               <w:jc w:val="left"/>
             </w:pPr>
             <w:r>
-              <w:rPr>
-                <w:rFonts w:ascii="NanumGothic" w:hAnsi="NanumGothic" w:eastAsia="NanumGothic"/>
-                <w:sz w:val="20"/>
-              </w:rPr>
-              <w:t>소비자 관점의 항공권 구매 의사결정 보조</w:t>
+              <w:t>소비자의 항공권 구매 시 합리적 소비를 지원하는 의사결정 보조</w:t>
             </w:r>
           </w:p>
         </w:tc>
@@ -411,50 +241,42 @@
         <w:tc>
           <w:tcPr>
             <w:tcW w:type="dxa" w:w="4816"/>
-            <w:tcBorders>
-              <w:top w:val="single" w:sz="6" w:color="D9E2F2" w:space="0"/>
-              <w:left w:val="single" w:sz="6" w:color="D9E2F2" w:space="0"/>
-              <w:bottom w:val="single" w:sz="6" w:color="D9E2F2" w:space="0"/>
-              <w:right w:val="single" w:sz="6" w:color="D9E2F2" w:space="0"/>
-            </w:tcBorders>
+            <w:tcMar>
+              <w:top w:w="80" w:type="dxa"/>
+              <w:start w:w="90" w:type="dxa"/>
+              <w:bottom w:w="80" w:type="dxa"/>
+              <w:end w:w="90" w:type="dxa"/>
+            </w:tcMar>
             <w:vAlign w:val="center"/>
           </w:tcPr>
           <w:p>
             <w:pPr>
-              <w:spacing w:before="60" w:after="60"/>
+              <w:spacing w:after="20"/>
               <w:jc w:val="center"/>
             </w:pPr>
             <w:r>
-              <w:rPr>
-                <w:rFonts w:ascii="NanumGothic" w:hAnsi="NanumGothic" w:eastAsia="NanumGothic"/>
-                <w:sz w:val="20"/>
-              </w:rPr>
-              <w:t>현재 우선 과제</w:t>
+              <w:t>핵심 질문</w:t>
             </w:r>
           </w:p>
         </w:tc>
         <w:tc>
           <w:tcPr>
             <w:tcW w:type="dxa" w:w="4816"/>
-            <w:tcBorders>
-              <w:top w:val="single" w:sz="6" w:color="D9E2F2" w:space="0"/>
-              <w:left w:val="single" w:sz="6" w:color="D9E2F2" w:space="0"/>
-              <w:bottom w:val="single" w:sz="6" w:color="D9E2F2" w:space="0"/>
-              <w:right w:val="single" w:sz="6" w:color="D9E2F2" w:space="0"/>
-            </w:tcBorders>
+            <w:tcMar>
+              <w:top w:w="80" w:type="dxa"/>
+              <w:start w:w="90" w:type="dxa"/>
+              <w:bottom w:w="80" w:type="dxa"/>
+              <w:end w:w="90" w:type="dxa"/>
+            </w:tcMar>
             <w:vAlign w:val="center"/>
           </w:tcPr>
           <w:p>
             <w:pPr>
-              <w:spacing w:before="60" w:after="60"/>
+              <w:spacing w:after="20"/>
               <w:jc w:val="left"/>
             </w:pPr>
             <w:r>
-              <w:rPr>
-                <w:rFonts w:ascii="NanumGothic" w:hAnsi="NanumGothic" w:eastAsia="NanumGothic"/>
-                <w:sz w:val="20"/>
-              </w:rPr>
-              <w:t>데이터 바운더리 확인</w:t>
+              <w:t>지금 예약할지, 관망할지, 날짜 조정이 가능한지 판단할 수 있는가</w:t>
             </w:r>
           </w:p>
         </w:tc>
@@ -463,50 +285,42 @@
         <w:tc>
           <w:tcPr>
             <w:tcW w:type="dxa" w:w="4816"/>
-            <w:tcBorders>
-              <w:top w:val="single" w:sz="6" w:color="D9E2F2" w:space="0"/>
-              <w:left w:val="single" w:sz="6" w:color="D9E2F2" w:space="0"/>
-              <w:bottom w:val="single" w:sz="6" w:color="D9E2F2" w:space="0"/>
-              <w:right w:val="single" w:sz="6" w:color="D9E2F2" w:space="0"/>
-            </w:tcBorders>
+            <w:tcMar>
+              <w:top w:w="80" w:type="dxa"/>
+              <w:start w:w="90" w:type="dxa"/>
+              <w:bottom w:w="80" w:type="dxa"/>
+              <w:end w:w="90" w:type="dxa"/>
+            </w:tcMar>
             <w:vAlign w:val="center"/>
           </w:tcPr>
           <w:p>
             <w:pPr>
-              <w:spacing w:before="60" w:after="60"/>
+              <w:spacing w:after="20"/>
               <w:jc w:val="center"/>
             </w:pPr>
             <w:r>
-              <w:rPr>
-                <w:rFonts w:ascii="NanumGothic" w:hAnsi="NanumGothic" w:eastAsia="NanumGothic"/>
-                <w:sz w:val="20"/>
-              </w:rPr>
-              <w:t>산출물 성격</w:t>
+              <w:t>현재 단계</w:t>
             </w:r>
           </w:p>
         </w:tc>
         <w:tc>
           <w:tcPr>
             <w:tcW w:type="dxa" w:w="4816"/>
-            <w:tcBorders>
-              <w:top w:val="single" w:sz="6" w:color="D9E2F2" w:space="0"/>
-              <w:left w:val="single" w:sz="6" w:color="D9E2F2" w:space="0"/>
-              <w:bottom w:val="single" w:sz="6" w:color="D9E2F2" w:space="0"/>
-              <w:right w:val="single" w:sz="6" w:color="D9E2F2" w:space="0"/>
-            </w:tcBorders>
+            <w:tcMar>
+              <w:top w:w="80" w:type="dxa"/>
+              <w:start w:w="90" w:type="dxa"/>
+              <w:bottom w:w="80" w:type="dxa"/>
+              <w:end w:w="90" w:type="dxa"/>
+            </w:tcMar>
             <w:vAlign w:val="center"/>
           </w:tcPr>
           <w:p>
             <w:pPr>
-              <w:spacing w:before="60" w:after="60"/>
+              <w:spacing w:after="20"/>
               <w:jc w:val="left"/>
             </w:pPr>
             <w:r>
-              <w:rPr>
-                <w:rFonts w:ascii="NanumGothic" w:hAnsi="NanumGothic" w:eastAsia="NanumGothic"/>
-                <w:sz w:val="20"/>
-              </w:rPr>
-              <w:t>가격 수준·변동성·가이드·설명을 포함한 대시보드 지향</w:t>
+              <w:t>데이터 바운더리와 분석 단위 가능 범위를 확인하는 단계</w:t>
             </w:r>
           </w:p>
         </w:tc>
@@ -515,50 +329,42 @@
         <w:tc>
           <w:tcPr>
             <w:tcW w:type="dxa" w:w="4816"/>
-            <w:tcBorders>
-              <w:top w:val="single" w:sz="6" w:color="D9E2F2" w:space="0"/>
-              <w:left w:val="single" w:sz="6" w:color="D9E2F2" w:space="0"/>
-              <w:bottom w:val="single" w:sz="6" w:color="D9E2F2" w:space="0"/>
-              <w:right w:val="single" w:sz="6" w:color="D9E2F2" w:space="0"/>
-            </w:tcBorders>
+            <w:tcMar>
+              <w:top w:w="80" w:type="dxa"/>
+              <w:start w:w="90" w:type="dxa"/>
+              <w:bottom w:w="80" w:type="dxa"/>
+              <w:end w:w="90" w:type="dxa"/>
+            </w:tcMar>
             <w:vAlign w:val="center"/>
           </w:tcPr>
           <w:p>
             <w:pPr>
-              <w:spacing w:before="60" w:after="60"/>
+              <w:spacing w:after="20"/>
               <w:jc w:val="center"/>
             </w:pPr>
             <w:r>
-              <w:rPr>
-                <w:rFonts w:ascii="NanumGothic" w:hAnsi="NanumGothic" w:eastAsia="NanumGothic"/>
-                <w:sz w:val="20"/>
-              </w:rPr>
-              <w:t>문서 활용 방식</w:t>
+              <w:t>결과물 방향</w:t>
             </w:r>
           </w:p>
         </w:tc>
         <w:tc>
           <w:tcPr>
             <w:tcW w:type="dxa" w:w="4816"/>
-            <w:tcBorders>
-              <w:top w:val="single" w:sz="6" w:color="D9E2F2" w:space="0"/>
-              <w:left w:val="single" w:sz="6" w:color="D9E2F2" w:space="0"/>
-              <w:bottom w:val="single" w:sz="6" w:color="D9E2F2" w:space="0"/>
-              <w:right w:val="single" w:sz="6" w:color="D9E2F2" w:space="0"/>
-            </w:tcBorders>
+            <w:tcMar>
+              <w:top w:w="80" w:type="dxa"/>
+              <w:start w:w="90" w:type="dxa"/>
+              <w:bottom w:w="80" w:type="dxa"/>
+              <w:end w:w="90" w:type="dxa"/>
+            </w:tcMar>
             <w:vAlign w:val="center"/>
           </w:tcPr>
           <w:p>
             <w:pPr>
-              <w:spacing w:before="60" w:after="60"/>
+              <w:spacing w:after="20"/>
               <w:jc w:val="left"/>
             </w:pPr>
             <w:r>
-              <w:rPr>
-                <w:rFonts w:ascii="NanumGothic" w:hAnsi="NanumGothic" w:eastAsia="NanumGothic"/>
-                <w:sz w:val="20"/>
-              </w:rPr>
-              <w:t>체크리스트 이전 정렬 문서이자 중간 점검 앵커</w:t>
+              <w:t>가격 수준, 리드타임, 단기 위험도, 설명 가능한 근거를 포함한 형태</w:t>
             </w:r>
           </w:p>
         </w:tc>
@@ -568,526 +374,229 @@
     <w:p>
       <w:pPr>
         <w:pStyle w:val="Heading1"/>
-        <w:spacing w:before="200" w:after="80"/>
+        <w:spacing w:before="160" w:after="80"/>
       </w:pPr>
       <w:r>
-        <w:rPr>
-          <w:rFonts w:ascii="NanumGothic" w:hAnsi="NanumGothic" w:eastAsia="NanumGothic"/>
-        </w:rPr>
-        <w:t>3. 아직 확정하지 않는 것</w:t>
+        <w:t>2. 현 단계에서 확정하지 않는 항목</w:t>
       </w:r>
     </w:p>
     <w:p>
       <w:pPr>
-        <w:spacing w:after="60"/>
-        <w:ind w:left="227" w:hanging="113"/>
+        <w:spacing w:after="40"/>
+        <w:ind w:left="113"/>
       </w:pPr>
       <w:r>
         <w:rPr>
-          <w:rFonts w:ascii="NanumGothic" w:hAnsi="NanumGothic" w:eastAsia="NanumGothic"/>
-          <w:sz w:val="20"/>
+          <w:b/>
         </w:rPr>
-        <w:t>• 카테고리 범위를 한국-일본 전체로 볼지, 인천발 일본으로 축소할지</w:t>
+        <w:t xml:space="preserve">• </w:t>
+      </w:r>
+      <w:r>
+        <w:t>카테고리 범위를 한국–일본 전체로 둘지, 특정 출발 공항군으로 축소할지 여부</w:t>
       </w:r>
     </w:p>
     <w:p>
       <w:pPr>
-        <w:spacing w:after="60"/>
-        <w:ind w:left="227" w:hanging="113"/>
+        <w:spacing w:after="40"/>
+        <w:ind w:left="113"/>
       </w:pPr>
       <w:r>
         <w:rPr>
-          <w:rFonts w:ascii="NanumGothic" w:hAnsi="NanumGothic" w:eastAsia="NanumGothic"/>
-          <w:sz w:val="20"/>
+          <w:b/>
         </w:rPr>
-        <w:t>• 분석 최소 단위를 도시권, 공항쌍, 개별 노선 중 어디로 둘지</w:t>
+        <w:t xml:space="preserve">• </w:t>
+      </w:r>
+      <w:r>
+        <w:t>분석 최소 단위를 도시권, 공항쌍, 개별 노선 중 어디에 둘지 여부</w:t>
       </w:r>
     </w:p>
     <w:p>
       <w:pPr>
-        <w:spacing w:after="60"/>
-        <w:ind w:left="227" w:hanging="113"/>
+        <w:spacing w:after="40"/>
+        <w:ind w:left="113"/>
       </w:pPr>
       <w:r>
         <w:rPr>
-          <w:rFonts w:ascii="NanumGothic" w:hAnsi="NanumGothic" w:eastAsia="NanumGothic"/>
-          <w:sz w:val="20"/>
+          <w:b/>
         </w:rPr>
-        <w:t>• 가격 데이터의 핵심 소스와 과거 히스토리 확보 방식</w:t>
+        <w:t xml:space="preserve">• </w:t>
+      </w:r>
+      <w:r>
+        <w:t>가격 데이터의 핵심 소스와 과거 히스토리 확보 방식</w:t>
       </w:r>
     </w:p>
     <w:p>
       <w:pPr>
-        <w:spacing w:after="60"/>
-        <w:ind w:left="227" w:hanging="113"/>
+        <w:spacing w:after="40"/>
+        <w:ind w:left="113"/>
       </w:pPr>
       <w:r>
         <w:rPr>
-          <w:rFonts w:ascii="NanumGothic" w:hAnsi="NanumGothic" w:eastAsia="NanumGothic"/>
-          <w:sz w:val="20"/>
+          <w:b/>
         </w:rPr>
-        <w:t>• 예측 기간, 모델 방식, 이벤트 변수 반영 수준</w:t>
+        <w:t xml:space="preserve">• </w:t>
+      </w:r>
+      <w:r>
+        <w:t>예측 기간, 모델 방식, 이벤트 변수 반영 수준</w:t>
       </w:r>
     </w:p>
     <w:p>
       <w:pPr>
-        <w:spacing w:after="60"/>
-        <w:ind w:left="227" w:hanging="113"/>
+        <w:spacing w:after="40"/>
+        <w:ind w:left="113"/>
       </w:pPr>
       <w:r>
         <w:rPr>
-          <w:rFonts w:ascii="NanumGothic" w:hAnsi="NanumGothic" w:eastAsia="NanumGothic"/>
-          <w:sz w:val="20"/>
+          <w:b/>
         </w:rPr>
-        <w:t>• 대표 노선 수와 MVP 화면 구조</w:t>
+        <w:t xml:space="preserve">• </w:t>
+      </w:r>
+      <w:r>
+        <w:t>대표 노선 수와 MVP 화면 구조</w:t>
       </w:r>
     </w:p>
     <w:p>
       <w:pPr>
         <w:pStyle w:val="Heading1"/>
-        <w:spacing w:before="200" w:after="80"/>
+        <w:spacing w:before="160" w:after="80"/>
       </w:pPr>
       <w:r>
-        <w:rPr>
-          <w:rFonts w:ascii="NanumGothic" w:hAnsi="NanumGothic" w:eastAsia="NanumGothic"/>
-        </w:rPr>
-        <w:t>4. 현재 단계에서 가장 중요한 질문</w:t>
-      </w:r>
-    </w:p>
-    <w:tbl>
-      <w:tblPr>
-        <w:tblW w:type="auto" w:w="0"/>
-        <w:jc w:val="center"/>
-        <w:tblLook w:firstColumn="1" w:firstRow="1" w:lastColumn="0" w:lastRow="0" w:noHBand="0" w:noVBand="1" w:val="04A0"/>
-      </w:tblPr>
-      <w:tblGrid>
-        <w:gridCol w:w="8784"/>
-      </w:tblGrid>
-      <w:tr>
-        <w:tc>
-          <w:tcPr>
-            <w:tcW w:type="dxa" w:w="9632"/>
-            <w:vAlign w:val="center"/>
-            <w:shd w:fill="EAF2FF"/>
-            <w:tcBorders>
-              <w:top w:val="single" w:sz="8" w:color="D9E2F2" w:space="0"/>
-              <w:left w:val="single" w:sz="8" w:color="D9E2F2" w:space="0"/>
-              <w:bottom w:val="single" w:sz="8" w:color="D9E2F2" w:space="0"/>
-              <w:right w:val="single" w:sz="8" w:color="D9E2F2" w:space="0"/>
-            </w:tcBorders>
-          </w:tcPr>
-          <w:p>
-            <w:pPr>
-              <w:spacing w:before="80" w:after="80"/>
-            </w:pPr>
-            <w:r>
-              <w:rPr>
-                <w:rFonts w:ascii="NanumGothic" w:hAnsi="NanumGothic" w:eastAsia="NanumGothic"/>
-                <w:b/>
-                <w:color w:val="2563EB"/>
-                <w:sz w:val="21"/>
-              </w:rPr>
-              <w:t>핵심 질문 3개</w:t>
-            </w:r>
-          </w:p>
-        </w:tc>
-      </w:tr>
-      <w:tr>
-        <w:tc>
-          <w:tcPr>
-            <w:tcW w:type="dxa" w:w="9632"/>
-            <w:vAlign w:val="center"/>
-            <w:shd w:fill="FFFFFF"/>
-            <w:tcBorders>
-              <w:top w:val="single" w:sz="8" w:color="D9E2F2" w:space="0"/>
-              <w:left w:val="single" w:sz="8" w:color="D9E2F2" w:space="0"/>
-              <w:bottom w:val="single" w:sz="8" w:color="D9E2F2" w:space="0"/>
-              <w:right w:val="single" w:sz="8" w:color="D9E2F2" w:space="0"/>
-            </w:tcBorders>
-          </w:tcPr>
-          <w:p>
-            <w:pPr>
-              <w:spacing w:before="80" w:after="80"/>
-            </w:pPr>
-            <w:r>
-              <w:rPr>
-                <w:rFonts w:ascii="NanumGothic" w:hAnsi="NanumGothic" w:eastAsia="NanumGothic"/>
-                <w:b w:val="0"/>
-                <w:sz w:val="20"/>
-              </w:rPr>
-              <w:t>한국 측 공항 범위를 실제로 어디까지 설명할 수 있는가.</w:t>
-            </w:r>
-          </w:p>
-        </w:tc>
-      </w:tr>
-      <w:tr>
-        <w:tc>
-          <w:tcPr>
-            <w:tcW w:type="dxa" w:w="9632"/>
-            <w:vAlign w:val="center"/>
-            <w:shd w:fill="FFFFFF"/>
-            <w:tcBorders>
-              <w:top w:val="single" w:sz="8" w:color="D9E2F2" w:space="0"/>
-              <w:left w:val="single" w:sz="8" w:color="D9E2F2" w:space="0"/>
-              <w:bottom w:val="single" w:sz="8" w:color="D9E2F2" w:space="0"/>
-              <w:right w:val="single" w:sz="8" w:color="D9E2F2" w:space="0"/>
-            </w:tcBorders>
-          </w:tcPr>
-          <w:p>
-            <w:pPr>
-              <w:spacing w:before="80" w:after="80"/>
-            </w:pPr>
-            <w:r>
-              <w:rPr>
-                <w:rFonts w:ascii="NanumGothic" w:hAnsi="NanumGothic" w:eastAsia="NanumGothic"/>
-                <w:b w:val="0"/>
-                <w:sz w:val="20"/>
-              </w:rPr>
-              <w:t>가격 데이터를 실제로 어디서 어떻게 받을 수 있는가.</w:t>
-            </w:r>
-          </w:p>
-        </w:tc>
-      </w:tr>
-      <w:tr>
-        <w:tc>
-          <w:tcPr>
-            <w:tcW w:type="dxa" w:w="9632"/>
-            <w:vAlign w:val="center"/>
-            <w:shd w:fill="FFFFFF"/>
-            <w:tcBorders>
-              <w:top w:val="single" w:sz="8" w:color="D9E2F2" w:space="0"/>
-              <w:left w:val="single" w:sz="8" w:color="D9E2F2" w:space="0"/>
-              <w:bottom w:val="single" w:sz="8" w:color="D9E2F2" w:space="0"/>
-              <w:right w:val="single" w:sz="8" w:color="D9E2F2" w:space="0"/>
-            </w:tcBorders>
-          </w:tcPr>
-          <w:p>
-            <w:pPr>
-              <w:spacing w:before="80" w:after="80"/>
-            </w:pPr>
-            <w:r>
-              <w:rPr>
-                <w:rFonts w:ascii="NanumGothic" w:hAnsi="NanumGothic" w:eastAsia="NanumGothic"/>
-                <w:b w:val="0"/>
-                <w:sz w:val="20"/>
-              </w:rPr>
-              <w:t>그 데이터를 국가권·도시권·공항쌍 중 어떤 단위로 다룰 수 있는가.</w:t>
-            </w:r>
-          </w:p>
-        </w:tc>
-      </w:tr>
-    </w:tbl>
-    <w:p/>
-    <w:p>
-      <w:pPr>
-        <w:pStyle w:val="Heading1"/>
-        <w:spacing w:before="200" w:after="80"/>
-      </w:pPr>
-      <w:r>
-        <w:rPr>
-          <w:rFonts w:ascii="NanumGothic" w:hAnsi="NanumGothic" w:eastAsia="NanumGothic"/>
-        </w:rPr>
-        <w:t>5. 다음으로 넘길 작업</w:t>
-      </w:r>
-    </w:p>
-    <w:tbl>
-      <w:tblPr>
-        <w:tblW w:type="auto" w:w="0"/>
-        <w:jc w:val="center"/>
-        <w:tblLook w:firstColumn="1" w:firstRow="1" w:lastColumn="0" w:lastRow="0" w:noHBand="0" w:noVBand="1" w:val="04A0"/>
-      </w:tblPr>
-      <w:tblGrid>
-        <w:gridCol w:w="3024"/>
-        <w:gridCol w:w="5760"/>
-      </w:tblGrid>
-      <w:tr>
-        <w:tc>
-          <w:tcPr>
-            <w:tcW w:type="dxa" w:w="4816"/>
-            <w:shd w:fill="EDF3FB"/>
-            <w:tcBorders>
-              <w:top w:val="single" w:sz="6" w:color="D9E2F2" w:space="0"/>
-              <w:left w:val="single" w:sz="6" w:color="D9E2F2" w:space="0"/>
-              <w:bottom w:val="single" w:sz="6" w:color="D9E2F2" w:space="0"/>
-              <w:right w:val="single" w:sz="6" w:color="D9E2F2" w:space="0"/>
-            </w:tcBorders>
-          </w:tcPr>
-          <w:p>
-            <w:pPr>
-              <w:jc w:val="center"/>
-            </w:pPr>
-            <w:r>
-              <w:rPr>
-                <w:rFonts w:ascii="NanumGothic" w:hAnsi="NanumGothic" w:eastAsia="NanumGothic"/>
-                <w:b/>
-                <w:sz w:val="20"/>
-              </w:rPr>
-              <w:t>작업 묶음</w:t>
-            </w:r>
-          </w:p>
-        </w:tc>
-        <w:tc>
-          <w:tcPr>
-            <w:tcW w:type="dxa" w:w="4816"/>
-            <w:shd w:fill="EDF3FB"/>
-            <w:tcBorders>
-              <w:top w:val="single" w:sz="6" w:color="D9E2F2" w:space="0"/>
-              <w:left w:val="single" w:sz="6" w:color="D9E2F2" w:space="0"/>
-              <w:bottom w:val="single" w:sz="6" w:color="D9E2F2" w:space="0"/>
-              <w:right w:val="single" w:sz="6" w:color="D9E2F2" w:space="0"/>
-            </w:tcBorders>
-          </w:tcPr>
-          <w:p>
-            <w:pPr>
-              <w:jc w:val="center"/>
-            </w:pPr>
-            <w:r>
-              <w:rPr>
-                <w:rFonts w:ascii="NanumGothic" w:hAnsi="NanumGothic" w:eastAsia="NanumGothic"/>
-                <w:b/>
-                <w:sz w:val="20"/>
-              </w:rPr>
-              <w:t>체크 포인트</w:t>
-            </w:r>
-          </w:p>
-        </w:tc>
-      </w:tr>
-      <w:tr>
-        <w:tc>
-          <w:tcPr>
-            <w:tcW w:type="dxa" w:w="4816"/>
-            <w:tcBorders>
-              <w:top w:val="single" w:sz="6" w:color="D9E2F2" w:space="0"/>
-              <w:left w:val="single" w:sz="6" w:color="D9E2F2" w:space="0"/>
-              <w:bottom w:val="single" w:sz="6" w:color="D9E2F2" w:space="0"/>
-              <w:right w:val="single" w:sz="6" w:color="D9E2F2" w:space="0"/>
-            </w:tcBorders>
-            <w:vAlign w:val="center"/>
-          </w:tcPr>
-          <w:p>
-            <w:pPr>
-              <w:spacing w:before="60" w:after="60"/>
-              <w:jc w:val="center"/>
-            </w:pPr>
-            <w:r>
-              <w:rPr>
-                <w:rFonts w:ascii="NanumGothic" w:hAnsi="NanumGothic" w:eastAsia="NanumGothic"/>
-                <w:sz w:val="20"/>
-              </w:rPr>
-              <w:t>관계 데이터 확인</w:t>
-            </w:r>
-          </w:p>
-        </w:tc>
-        <w:tc>
-          <w:tcPr>
-            <w:tcW w:type="dxa" w:w="4816"/>
-            <w:tcBorders>
-              <w:top w:val="single" w:sz="6" w:color="D9E2F2" w:space="0"/>
-              <w:left w:val="single" w:sz="6" w:color="D9E2F2" w:space="0"/>
-              <w:bottom w:val="single" w:sz="6" w:color="D9E2F2" w:space="0"/>
-              <w:right w:val="single" w:sz="6" w:color="D9E2F2" w:space="0"/>
-            </w:tcBorders>
-            <w:vAlign w:val="center"/>
-          </w:tcPr>
-          <w:p>
-            <w:pPr>
-              <w:spacing w:before="60" w:after="60"/>
-              <w:jc w:val="left"/>
-            </w:pPr>
-            <w:r>
-              <w:rPr>
-                <w:rFonts w:ascii="NanumGothic" w:hAnsi="NanumGothic" w:eastAsia="NanumGothic"/>
-                <w:sz w:val="20"/>
-              </w:rPr>
-              <w:t>IIAC와 KAC를 분리해 한국 측 공항 범위 설명 가능 여부 점검</w:t>
-            </w:r>
-          </w:p>
-        </w:tc>
-      </w:tr>
-      <w:tr>
-        <w:tc>
-          <w:tcPr>
-            <w:tcW w:type="dxa" w:w="4816"/>
-            <w:tcBorders>
-              <w:top w:val="single" w:sz="6" w:color="D9E2F2" w:space="0"/>
-              <w:left w:val="single" w:sz="6" w:color="D9E2F2" w:space="0"/>
-              <w:bottom w:val="single" w:sz="6" w:color="D9E2F2" w:space="0"/>
-              <w:right w:val="single" w:sz="6" w:color="D9E2F2" w:space="0"/>
-            </w:tcBorders>
-            <w:vAlign w:val="center"/>
-          </w:tcPr>
-          <w:p>
-            <w:pPr>
-              <w:spacing w:before="60" w:after="60"/>
-              <w:jc w:val="center"/>
-            </w:pPr>
-            <w:r>
-              <w:rPr>
-                <w:rFonts w:ascii="NanumGothic" w:hAnsi="NanumGothic" w:eastAsia="NanumGothic"/>
-                <w:sz w:val="20"/>
-              </w:rPr>
-              <w:t>가격 API 실테스트</w:t>
-            </w:r>
-          </w:p>
-        </w:tc>
-        <w:tc>
-          <w:tcPr>
-            <w:tcW w:type="dxa" w:w="4816"/>
-            <w:tcBorders>
-              <w:top w:val="single" w:sz="6" w:color="D9E2F2" w:space="0"/>
-              <w:left w:val="single" w:sz="6" w:color="D9E2F2" w:space="0"/>
-              <w:bottom w:val="single" w:sz="6" w:color="D9E2F2" w:space="0"/>
-              <w:right w:val="single" w:sz="6" w:color="D9E2F2" w:space="0"/>
-            </w:tcBorders>
-            <w:vAlign w:val="center"/>
-          </w:tcPr>
-          <w:p>
-            <w:pPr>
-              <w:spacing w:before="60" w:after="60"/>
-              <w:jc w:val="left"/>
-            </w:pPr>
-            <w:r>
-              <w:rPr>
-                <w:rFonts w:ascii="NanumGothic" w:hAnsi="NanumGothic" w:eastAsia="NanumGothic"/>
-                <w:sz w:val="20"/>
-              </w:rPr>
-              <w:t>현재가, 과거 히스토리, 공항쌍/도시쌍 지원 여부 확인</w:t>
-            </w:r>
-          </w:p>
-        </w:tc>
-      </w:tr>
-      <w:tr>
-        <w:tc>
-          <w:tcPr>
-            <w:tcW w:type="dxa" w:w="4816"/>
-            <w:tcBorders>
-              <w:top w:val="single" w:sz="6" w:color="D9E2F2" w:space="0"/>
-              <w:left w:val="single" w:sz="6" w:color="D9E2F2" w:space="0"/>
-              <w:bottom w:val="single" w:sz="6" w:color="D9E2F2" w:space="0"/>
-              <w:right w:val="single" w:sz="6" w:color="D9E2F2" w:space="0"/>
-            </w:tcBorders>
-            <w:vAlign w:val="center"/>
-          </w:tcPr>
-          <w:p>
-            <w:pPr>
-              <w:spacing w:before="60" w:after="60"/>
-              <w:jc w:val="center"/>
-            </w:pPr>
-            <w:r>
-              <w:rPr>
-                <w:rFonts w:ascii="NanumGothic" w:hAnsi="NanumGothic" w:eastAsia="NanumGothic"/>
-                <w:sz w:val="20"/>
-              </w:rPr>
-              <w:t>마스터 정리</w:t>
-            </w:r>
-          </w:p>
-        </w:tc>
-        <w:tc>
-          <w:tcPr>
-            <w:tcW w:type="dxa" w:w="4816"/>
-            <w:tcBorders>
-              <w:top w:val="single" w:sz="6" w:color="D9E2F2" w:space="0"/>
-              <w:left w:val="single" w:sz="6" w:color="D9E2F2" w:space="0"/>
-              <w:bottom w:val="single" w:sz="6" w:color="D9E2F2" w:space="0"/>
-              <w:right w:val="single" w:sz="6" w:color="D9E2F2" w:space="0"/>
-            </w:tcBorders>
-            <w:vAlign w:val="center"/>
-          </w:tcPr>
-          <w:p>
-            <w:pPr>
-              <w:spacing w:before="60" w:after="60"/>
-              <w:jc w:val="left"/>
-            </w:pPr>
-            <w:r>
-              <w:rPr>
-                <w:rFonts w:ascii="NanumGothic" w:hAnsi="NanumGothic" w:eastAsia="NanumGothic"/>
-                <w:sz w:val="20"/>
-              </w:rPr>
-              <w:t>공항코드와 도시코드 분리, 대표 사례 메모 정리</w:t>
-            </w:r>
-          </w:p>
-        </w:tc>
-      </w:tr>
-      <w:tr>
-        <w:tc>
-          <w:tcPr>
-            <w:tcW w:type="dxa" w:w="4816"/>
-            <w:tcBorders>
-              <w:top w:val="single" w:sz="6" w:color="D9E2F2" w:space="0"/>
-              <w:left w:val="single" w:sz="6" w:color="D9E2F2" w:space="0"/>
-              <w:bottom w:val="single" w:sz="6" w:color="D9E2F2" w:space="0"/>
-              <w:right w:val="single" w:sz="6" w:color="D9E2F2" w:space="0"/>
-            </w:tcBorders>
-            <w:vAlign w:val="center"/>
-          </w:tcPr>
-          <w:p>
-            <w:pPr>
-              <w:spacing w:before="60" w:after="60"/>
-              <w:jc w:val="center"/>
-            </w:pPr>
-            <w:r>
-              <w:rPr>
-                <w:rFonts w:ascii="NanumGothic" w:hAnsi="NanumGothic" w:eastAsia="NanumGothic"/>
-                <w:sz w:val="20"/>
-              </w:rPr>
-              <w:t>분석 단위 비교</w:t>
-            </w:r>
-          </w:p>
-        </w:tc>
-        <w:tc>
-          <w:tcPr>
-            <w:tcW w:type="dxa" w:w="4816"/>
-            <w:tcBorders>
-              <w:top w:val="single" w:sz="6" w:color="D9E2F2" w:space="0"/>
-              <w:left w:val="single" w:sz="6" w:color="D9E2F2" w:space="0"/>
-              <w:bottom w:val="single" w:sz="6" w:color="D9E2F2" w:space="0"/>
-              <w:right w:val="single" w:sz="6" w:color="D9E2F2" w:space="0"/>
-            </w:tcBorders>
-            <w:vAlign w:val="center"/>
-          </w:tcPr>
-          <w:p>
-            <w:pPr>
-              <w:spacing w:before="60" w:after="60"/>
-              <w:jc w:val="left"/>
-            </w:pPr>
-            <w:r>
-              <w:rPr>
-                <w:rFonts w:ascii="NanumGothic" w:hAnsi="NanumGothic" w:eastAsia="NanumGothic"/>
-                <w:sz w:val="20"/>
-              </w:rPr>
-              <w:t>후보 2안을 작성하되 지금은 확정하지 않음</w:t>
-            </w:r>
-          </w:p>
-        </w:tc>
-      </w:tr>
-    </w:tbl>
-    <w:p/>
-    <w:p>
-      <w:pPr>
-        <w:pStyle w:val="Heading1"/>
-        <w:spacing w:before="200" w:after="80"/>
-      </w:pPr>
-      <w:r>
-        <w:rPr>
-          <w:rFonts w:ascii="NanumGothic" w:hAnsi="NanumGothic" w:eastAsia="NanumGothic"/>
-        </w:rPr>
-        <w:t>6. 문서 사용 원칙</w:t>
+        <w:t>3. 현재 단계의 핵심 질문</w:t>
       </w:r>
     </w:p>
     <w:p>
       <w:pPr>
-        <w:spacing w:lineRule="auto" w:line="307" w:after="120"/>
+        <w:spacing w:after="40"/>
+        <w:ind w:left="113"/>
       </w:pPr>
       <w:r>
         <w:rPr>
-          <w:rFonts w:ascii="NanumGothic" w:hAnsi="NanumGothic" w:eastAsia="NanumGothic"/>
+          <w:b/>
         </w:rPr>
-        <w:t>이 문서를 읽는 사람은 먼저 현재 방향을 이해하고, 이후 세부 탐색은 체크리스트와 별도 연구문서에서 확인하면 된다. 즉 이 문서는 주제 흐름 전체를 설명하는 본문이 아니라, 프로젝트의 현재 위치와 다음 질문을 한눈에 정리하는 문서로 사용한다.</w:t>
+        <w:t xml:space="preserve">• </w:t>
+      </w:r>
+      <w:r>
+        <w:t>한국 측 공항 범위를 실제로 어디까지 확보할 수 있는가</w:t>
+      </w:r>
+    </w:p>
+    <w:p>
+      <w:pPr>
+        <w:spacing w:after="40"/>
+        <w:ind w:left="113"/>
+      </w:pPr>
+      <w:r>
+        <w:rPr>
+          <w:b/>
+        </w:rPr>
+        <w:t xml:space="preserve">• </w:t>
+      </w:r>
+      <w:r>
+        <w:t>가격 데이터를 실제로 어디서 받을 수 있는가</w:t>
+      </w:r>
+    </w:p>
+    <w:p>
+      <w:pPr>
+        <w:spacing w:after="40"/>
+        <w:ind w:left="113"/>
+      </w:pPr>
+      <w:r>
+        <w:rPr>
+          <w:b/>
+        </w:rPr>
+        <w:t xml:space="preserve">• </w:t>
+      </w:r>
+      <w:r>
+        <w:t>확보 가능한 데이터를 도시권·공항쌍·개별 노선 중 어떤 단위로 다룰 수 있는가</w:t>
+      </w:r>
+    </w:p>
+    <w:p>
+      <w:pPr>
+        <w:pStyle w:val="Heading1"/>
+        <w:spacing w:before="160" w:after="80"/>
+      </w:pPr>
+      <w:r>
+        <w:t>4. 다음 작업으로 넘길 항목</w:t>
+      </w:r>
+    </w:p>
+    <w:p>
+      <w:pPr>
+        <w:spacing w:after="40"/>
+        <w:ind w:left="113"/>
+      </w:pPr>
+      <w:r>
+        <w:rPr>
+          <w:b/>
+        </w:rPr>
+        <w:t xml:space="preserve">• </w:t>
+      </w:r>
+      <w:r>
+        <w:t>IIAC와 KAC를 분리해 관계 데이터 바운더리를 정리한다.</w:t>
+      </w:r>
+    </w:p>
+    <w:p>
+      <w:pPr>
+        <w:spacing w:after="40"/>
+        <w:ind w:left="113"/>
+      </w:pPr>
+      <w:r>
+        <w:rPr>
+          <w:b/>
+        </w:rPr>
+        <w:t xml:space="preserve">• </w:t>
+      </w:r>
+      <w:r>
+        <w:t>가격 API 후보를 실제 호출해 응답 필드, 공항쌍/도시쌍 지원 여부, 과거 히스토리 제공 여부를 확인한다.</w:t>
+      </w:r>
+    </w:p>
+    <w:p>
+      <w:pPr>
+        <w:spacing w:after="40"/>
+        <w:ind w:left="113"/>
+      </w:pPr>
+      <w:r>
+        <w:rPr>
+          <w:b/>
+        </w:rPr>
+        <w:t xml:space="preserve">• </w:t>
+      </w:r>
+      <w:r>
+        <w:t>도시코드와 공항코드를 분리한 한국·일본 공항/도시 마스터 초안을 작성한다.</w:t>
+      </w:r>
+    </w:p>
+    <w:p>
+      <w:pPr>
+        <w:spacing w:after="40"/>
+        <w:ind w:left="113"/>
+      </w:pPr>
+      <w:r>
+        <w:rPr>
+          <w:b/>
+        </w:rPr>
+        <w:t xml:space="preserve">• </w:t>
+      </w:r>
+      <w:r>
+        <w:t>분석 단위 후보 2안을 작성하되, 현 단계에서는 최종 확정하지 않는다.</w:t>
+      </w:r>
+    </w:p>
+    <w:p>
+      <w:pPr>
+        <w:pStyle w:val="Heading1"/>
+        <w:spacing w:before="160" w:after="80"/>
+      </w:pPr>
+      <w:r>
+        <w:t>5. 문서 운용 메모</w:t>
+      </w:r>
+    </w:p>
+    <w:p>
+      <w:pPr>
+        <w:spacing w:after="80" w:line="293" w:lineRule="auto"/>
+      </w:pPr>
+      <w:r>
+        <w:t>본 문서는 현재 위치와 다음 질문을 고정하는 용도로 사용한다. 세부 근거는 research 문서, 주제 기준선은 baseline 문서, 실제 검증 순서는 checklist 문서를 우선 참조한다.</w:t>
       </w:r>
     </w:p>
     <w:sectPr>
-      <w:headerReference w:type="default" r:id="rId9"/>
-      <w:footerReference w:type="default" r:id="rId10"/>
+      <w:footerReference w:type="default" r:id="rId9"/>
       <w:pgSz w:w="12240" w:h="15840"/>
       <w:pgMar w:top="1247" w:right="1304" w:bottom="1134" w:left="1304" w:header="720" w:footer="720" w:gutter="0"/>
       <w:cols w:space="720"/>
@@ -1102,97 +611,18 @@
   <w:p>
     <w:pPr>
       <w:pStyle w:val="Footer"/>
-    </w:pPr>
+      <w:jc w:val="right"/>
+    </w:pPr>
+    <w:r>
+      <w:t xml:space="preserve">Page </w:t>
+    </w:r>
+    <w:fldSimple w:instr="PAGE">
+      <w:r>
+        <w:t>1</w:t>
+      </w:r>
+    </w:fldSimple>
   </w:p>
-  <w:tbl>
-    <w:tblPr>
-      <w:tblW w:type="auto" w:w="0"/>
-      <w:jc w:val="center"/>
-      <w:tblLook w:firstColumn="1" w:firstRow="1" w:lastColumn="0" w:lastRow="0" w:noHBand="0" w:noVBand="1" w:val="04A0"/>
-    </w:tblPr>
-    <w:tblGrid>
-      <w:gridCol w:w="6912"/>
-      <w:gridCol w:w="2016"/>
-    </w:tblGrid>
-    <w:tr>
-      <w:tc>
-        <w:tcPr>
-          <w:tcW w:type="dxa" w:w="4464"/>
-          <w:tcBorders>
-            <w:top w:val="nil"/>
-            <w:left w:val="nil"/>
-            <w:bottom w:val="nil"/>
-            <w:right w:val="nil"/>
-          </w:tcBorders>
-        </w:tcPr>
-        <w:p>
-          <w:pPr>
-            <w:jc w:val="left"/>
-          </w:pPr>
-          <w:r>
-            <w:rPr>
-              <w:rFonts w:ascii="NanumGothic" w:hAnsi="NanumGothic" w:eastAsia="NanumGothic"/>
-              <w:color w:val="4B5563"/>
-              <w:sz w:val="17"/>
-            </w:rPr>
-            <w:t>Capstone Draft Pack</w:t>
-          </w:r>
-        </w:p>
-      </w:tc>
-      <w:tc>
-        <w:tcPr>
-          <w:tcW w:type="dxa" w:w="4464"/>
-          <w:tcBorders>
-            <w:top w:val="nil"/>
-            <w:left w:val="nil"/>
-            <w:bottom w:val="nil"/>
-            <w:right w:val="nil"/>
-          </w:tcBorders>
-        </w:tcPr>
-        <w:p>
-          <w:pPr>
-            <w:jc w:val="right"/>
-          </w:pPr>
-          <w:r>
-            <w:rPr>
-              <w:rFonts w:ascii="NanumGothic" w:hAnsi="NanumGothic" w:eastAsia="NanumGothic"/>
-              <w:color w:val="4B5563"/>
-              <w:sz w:val="17"/>
-            </w:rPr>
-            <w:t xml:space="preserve">Page </w:t>
-          </w:r>
-          <w:r>
-            <w:rPr>
-              <w:rFonts w:ascii="NanumGothic" w:hAnsi="NanumGothic" w:eastAsia="NanumGothic"/>
-              <w:color w:val="4B5563"/>
-              <w:sz w:val="17"/>
-            </w:rPr>
-            <w:fldSimple w:instr="PAGE"/>
-          </w:r>
-        </w:p>
-      </w:tc>
-    </w:tr>
-  </w:tbl>
 </w:ftr>
-</file>
-
-<file path=word/header1.xml><?xml version="1.0" encoding="utf-8"?>
-<w:hdr xmlns:m="http://schemas.openxmlformats.org/officeDocument/2006/math" xmlns:mc="http://schemas.openxmlformats.org/markup-compatibility/2006" xmlns:mo="http://schemas.microsoft.com/office/mac/office/2008/main" xmlns:mv="urn:schemas-microsoft-com:mac:vml" xmlns:o="urn:schemas-microsoft-com:office:office" xmlns:r="http://schemas.openxmlformats.org/officeDocument/2006/relationships" xmlns:v="urn:schemas-microsoft-com:vml" xmlns:w10="urn:schemas-microsoft-com:office:word" xmlns:w14="http://schemas.microsoft.com/office/word/2010/wordml" xmlns:w="http://schemas.openxmlformats.org/wordprocessingml/2006/main" xmlns:wne="http://schemas.microsoft.com/office/word/2006/wordml" xmlns:wp14="http://schemas.microsoft.com/office/word/2010/wordprocessingDrawing" xmlns:wp="http://schemas.openxmlformats.org/drawingml/2006/wordprocessingDrawing" xmlns:wpc="http://schemas.microsoft.com/office/word/2010/wordprocessingCanvas" xmlns:wpg="http://schemas.microsoft.com/office/word/2010/wordprocessingGroup" xmlns:wpi="http://schemas.microsoft.com/office/word/2010/wordprocessingInk" xmlns:wps="http://schemas.microsoft.com/office/word/2010/wordprocessingShape" mc:Ignorable="w14 wp14">
-  <w:p>
-    <w:pPr>
-      <w:pStyle w:val="Header"/>
-      <w:jc w:val="right"/>
-    </w:pPr>
-    <w:r>
-      <w:rPr>
-        <w:rFonts w:ascii="NanumGothic" w:hAnsi="NanumGothic" w:eastAsia="NanumGothic"/>
-        <w:color w:val="4B5563"/>
-        <w:sz w:val="17"/>
-      </w:rPr>
-      <w:t>build_anchor</w:t>
-    </w:r>
-  </w:p>
-</w:hdr>
 </file>
 
 <file path=word/numbering.xml><?xml version="1.0" encoding="utf-8"?>
@@ -1559,7 +989,7 @@
     <w:qFormat/>
     <w:rsid w:val="00FC693F"/>
     <w:rPr>
-      <w:rFonts w:ascii="NanumGothic" w:hAnsi="NanumGothic" w:eastAsia="NanumGothic"/>
+      <w:rFonts w:ascii="Malgun Gothic" w:hAnsi="Malgun Gothic" w:eastAsia="Malgun Gothic"/>
       <w:sz w:val="21"/>
     </w:rPr>
   </w:style>
@@ -1622,10 +1052,10 @@
       <w:outlineLvl w:val="0"/>
     </w:pPr>
     <w:rPr>
-      <w:rFonts w:asciiTheme="majorHAnsi" w:eastAsiaTheme="majorEastAsia" w:hAnsiTheme="majorHAnsi" w:cstheme="majorBidi" w:ascii="NanumGothic" w:hAnsi="NanumGothic" w:eastAsia="NanumGothic"/>
+      <w:rFonts w:asciiTheme="majorHAnsi" w:eastAsiaTheme="majorEastAsia" w:hAnsiTheme="majorHAnsi" w:cstheme="majorBidi" w:ascii="Malgun Gothic" w:hAnsi="Malgun Gothic" w:eastAsia="Malgun Gothic"/>
       <w:b/>
       <w:bCs/>
-      <w:color w:val="1F2937"/>
+      <w:color w:val="22344E"/>
       <w:sz w:val="30"/>
       <w:szCs w:val="28"/>
     </w:rPr>
@@ -1646,11 +1076,11 @@
       <w:outlineLvl w:val="1"/>
     </w:pPr>
     <w:rPr>
-      <w:rFonts w:asciiTheme="majorHAnsi" w:eastAsiaTheme="majorEastAsia" w:hAnsiTheme="majorHAnsi" w:cstheme="majorBidi" w:ascii="NanumGothic" w:hAnsi="NanumGothic" w:eastAsia="NanumGothic"/>
+      <w:rFonts w:asciiTheme="majorHAnsi" w:eastAsiaTheme="majorEastAsia" w:hAnsiTheme="majorHAnsi" w:cstheme="majorBidi" w:ascii="Malgun Gothic" w:hAnsi="Malgun Gothic" w:eastAsia="Malgun Gothic"/>
       <w:b/>
       <w:bCs/>
-      <w:color w:val="2563EB"/>
-      <w:sz w:val="24"/>
+      <w:color w:val="22344E"/>
+      <w:sz w:val="25"/>
       <w:szCs w:val="26"/>
     </w:rPr>
   </w:style>
@@ -1670,10 +1100,10 @@
       <w:outlineLvl w:val="2"/>
     </w:pPr>
     <w:rPr>
-      <w:rFonts w:asciiTheme="majorHAnsi" w:eastAsiaTheme="majorEastAsia" w:hAnsiTheme="majorHAnsi" w:cstheme="majorBidi" w:ascii="NanumGothic" w:hAnsi="NanumGothic" w:eastAsia="NanumGothic"/>
+      <w:rFonts w:asciiTheme="majorHAnsi" w:eastAsiaTheme="majorEastAsia" w:hAnsiTheme="majorHAnsi" w:cstheme="majorBidi" w:ascii="Malgun Gothic" w:hAnsi="Malgun Gothic" w:eastAsia="Malgun Gothic"/>
       <w:b/>
       <w:bCs/>
-      <w:color w:val="1F2937"/>
+      <w:color w:val="22344E"/>
       <w:sz w:val="22"/>
     </w:rPr>
   </w:style>
@@ -1912,12 +1342,11 @@
       <w:contextualSpacing/>
     </w:pPr>
     <w:rPr>
-      <w:rFonts w:asciiTheme="majorHAnsi" w:eastAsiaTheme="majorEastAsia" w:hAnsiTheme="majorHAnsi" w:cstheme="majorBidi" w:ascii="NanumGothic" w:hAnsi="NanumGothic" w:eastAsia="NanumGothic"/>
-      <w:b/>
-      <w:color w:val="1F2937"/>
+      <w:rFonts w:asciiTheme="majorHAnsi" w:eastAsiaTheme="majorEastAsia" w:hAnsiTheme="majorHAnsi" w:cstheme="majorBidi"/>
+      <w:color w:val="17365D" w:themeColor="text2" w:themeShade="BF"/>
       <w:spacing w:val="5"/>
       <w:kern w:val="28"/>
-      <w:sz w:val="44"/>
+      <w:sz w:val="52"/>
       <w:szCs w:val="52"/>
     </w:rPr>
   </w:style>
@@ -13247,20 +12676,19 @@
       </w:tcPr>
     </w:tblStylePr>
   </w:style>
-  <w:style w:type="paragraph" w:customStyle="1" w:styleId="SmallGray">
-    <w:name w:val="SmallGray"/>
-    <w:basedOn w:val="Normal"/>
+  <w:style w:type="paragraph" w:customStyle="1" w:styleId="SmallNote">
+    <w:name w:val="SmallNote"/>
     <w:rPr>
-      <w:rFonts w:ascii="NanumGothic" w:hAnsi="NanumGothic" w:eastAsia="NanumGothic"/>
-      <w:color w:val="4B5563"/>
+      <w:rFonts w:ascii="Malgun Gothic" w:hAnsi="Malgun Gothic" w:eastAsia="Malgun Gothic"/>
+      <w:color w:val="5A5A5A"/>
       <w:sz w:val="18"/>
     </w:rPr>
   </w:style>
-  <w:style w:type="paragraph" w:customStyle="1" w:styleId="BoxText">
-    <w:name w:val="BoxText"/>
-    <w:basedOn w:val="Normal"/>
+  <w:style w:type="paragraph" w:customStyle="1" w:styleId="Callout">
+    <w:name w:val="Callout"/>
     <w:rPr>
-      <w:rFonts w:ascii="NanumGothic" w:hAnsi="NanumGothic" w:eastAsia="NanumGothic"/>
+      <w:rFonts w:ascii="Malgun Gothic" w:hAnsi="Malgun Gothic" w:eastAsia="Malgun Gothic"/>
+      <w:color w:val="282828"/>
       <w:sz w:val="20"/>
     </w:rPr>
   </w:style>

</xml_diff>